<commit_message>
Update RightRent Project Book.docx
</commit_message>
<xml_diff>
--- a/RightRent Project Book.docx
+++ b/RightRent Project Book.docx
@@ -279,14 +279,15 @@
         </w:rPr>
         <w:t xml:space="preserve">GitHub Repository: </w:t>
       </w:r>
-      <w:r>
-        <w:rPr>
-          <w:rFonts w:ascii="Arial" w:hAnsi="Arial" w:cs="Arial"/>
-          <w:color w:val="0563C1"/>
-          <w:u w:val="single"/>
-        </w:rPr>
-        <w:t>https://github.com/ashrafatshy7/RightRent</w:t>
-      </w:r>
+      <w:hyperlink r:id="rId8" w:history="1">
+        <w:r>
+          <w:rPr>
+            <w:rStyle w:val="Hyperlink"/>
+            <w:rFonts w:ascii="Arial" w:hAnsi="Arial" w:cs="Arial"/>
+          </w:rPr>
+          <w:t>https://github.com/ashrafatshy7/RightRent</w:t>
+        </w:r>
+      </w:hyperlink>
     </w:p>
     <w:p>
       <w:pPr>
@@ -5008,7 +5009,7 @@
                     </pic:cNvPicPr>
                   </pic:nvPicPr>
                   <pic:blipFill>
-                    <a:blip r:embed="rId8"/>
+                    <a:blip r:embed="rId9"/>
                     <a:stretch>
                       <a:fillRect/>
                     </a:stretch>
@@ -7346,7 +7347,7 @@
                     </pic:cNvPicPr>
                   </pic:nvPicPr>
                   <pic:blipFill>
-                    <a:blip r:embed="rId9"/>
+                    <a:blip r:embed="rId10"/>
                     <a:stretch>
                       <a:fillRect/>
                     </a:stretch>
@@ -7452,7 +7453,7 @@
                     </pic:cNvPicPr>
                   </pic:nvPicPr>
                   <pic:blipFill>
-                    <a:blip r:embed="rId10"/>
+                    <a:blip r:embed="rId11"/>
                     <a:stretch>
                       <a:fillRect/>
                     </a:stretch>
@@ -7573,7 +7574,7 @@
                     </pic:cNvPicPr>
                   </pic:nvPicPr>
                   <pic:blipFill>
-                    <a:blip r:embed="rId11"/>
+                    <a:blip r:embed="rId12"/>
                     <a:stretch>
                       <a:fillRect/>
                     </a:stretch>
@@ -7711,7 +7712,7 @@
                     <pic:cNvPicPr/>
                   </pic:nvPicPr>
                   <pic:blipFill>
-                    <a:blip r:embed="rId12" cstate="print">
+                    <a:blip r:embed="rId13" cstate="print">
                       <a:extLst>
                         <a:ext uri="{28A0092B-C50C-407E-A947-70E740481C1C}">
                           <a14:useLocalDpi xmlns:a14="http://schemas.microsoft.com/office/drawing/2010/main" val="0"/>
@@ -7854,7 +7855,7 @@
                     </pic:cNvPicPr>
                   </pic:nvPicPr>
                   <pic:blipFill>
-                    <a:blip r:embed="rId13"/>
+                    <a:blip r:embed="rId14"/>
                     <a:stretch>
                       <a:fillRect/>
                     </a:stretch>
@@ -7958,7 +7959,7 @@
                     </pic:cNvPicPr>
                   </pic:nvPicPr>
                   <pic:blipFill>
-                    <a:blip r:embed="rId14"/>
+                    <a:blip r:embed="rId15"/>
                     <a:stretch>
                       <a:fillRect/>
                     </a:stretch>
@@ -11583,7 +11584,7 @@
                     </pic:cNvPicPr>
                   </pic:nvPicPr>
                   <pic:blipFill>
-                    <a:blip r:embed="rId15"/>
+                    <a:blip r:embed="rId16"/>
                     <a:stretch>
                       <a:fillRect/>
                     </a:stretch>
@@ -13465,7 +13466,7 @@
       <w:r>
         <w:t xml:space="preserve">Ref: </w:t>
       </w:r>
-      <w:hyperlink r:id="rId16">
+      <w:hyperlink r:id="rId17">
         <w:r>
           <w:rPr>
             <w:rStyle w:val="Hyperlink"/>
@@ -13529,7 +13530,7 @@
       <w:r>
         <w:t xml:space="preserve">Ref: </w:t>
       </w:r>
-      <w:hyperlink r:id="rId17">
+      <w:hyperlink r:id="rId18">
         <w:r>
           <w:rPr>
             <w:rStyle w:val="Hyperlink"/>
@@ -13560,7 +13561,7 @@
       <w:r>
         <w:t xml:space="preserve">Ref: </w:t>
       </w:r>
-      <w:hyperlink r:id="rId18">
+      <w:hyperlink r:id="rId19">
         <w:r>
           <w:rPr>
             <w:rStyle w:val="Hyperlink"/>
@@ -13617,7 +13618,7 @@
         <w:tab/>
         <w:t xml:space="preserve">Ref: </w:t>
       </w:r>
-      <w:hyperlink r:id="rId19">
+      <w:hyperlink r:id="rId20">
         <w:r>
           <w:rPr>
             <w:rStyle w:val="Hyperlink"/>
@@ -13693,7 +13694,7 @@
         </w:rPr>
         <w:t xml:space="preserve">Akerlof, G. A. (1970). The market for “lemons”: Quality uncertainty and the market mechanism. *The Quarterly Journal of Economics, 84*(3), 488-500. </w:t>
       </w:r>
-      <w:hyperlink r:id="rId20">
+      <w:hyperlink r:id="rId21">
         <w:r>
           <w:rPr>
             <w:rStyle w:val="Hyperlink"/>
@@ -13742,7 +13743,7 @@
         </w:rPr>
         <w:t xml:space="preserve"> </w:t>
       </w:r>
-      <w:hyperlink r:id="rId21">
+      <w:hyperlink r:id="rId22">
         <w:r>
           <w:rPr>
             <w:rStyle w:val="Hyperlink"/>
@@ -13794,7 +13795,7 @@
         </w:rPr>
         <w:t xml:space="preserve">Central Bureau of Statistics. (2025). *Dwellings and buildings in Israel, 2024*. Jerusalem: CBS. [Hebrew]. </w:t>
       </w:r>
-      <w:hyperlink r:id="rId22">
+      <w:hyperlink r:id="rId23">
         <w:r>
           <w:rPr>
             <w:rStyle w:val="Hyperlink"/>
@@ -13891,7 +13892,7 @@
         </w:rPr>
         <w:t xml:space="preserve">, 19-28. </w:t>
       </w:r>
-      <w:hyperlink r:id="rId23">
+      <w:hyperlink r:id="rId24">
         <w:r>
           <w:rPr>
             <w:rStyle w:val="Hyperlink"/>
@@ -13940,7 +13941,7 @@
         </w:rPr>
         <w:t xml:space="preserve"> (3rd ed.). Penguin Books. </w:t>
       </w:r>
-      <w:hyperlink r:id="rId24" w:anchor="v=onepage&amp;q=Getting%20to%20yes:%20Negotiating%20agreement%20without%20giving%20in%22%20Fisher%20Ury&amp;f=false" w:history="1">
+      <w:hyperlink r:id="rId25" w:anchor="v=onepage&amp;q=Getting%20to%20yes:%20Negotiating%20agreement%20without%20giving%20in%22%20Fisher%20Ury&amp;f=false" w:history="1">
         <w:r>
           <w:rPr>
             <w:rStyle w:val="Hyperlink"/>
@@ -13970,7 +13971,7 @@
         </w:rPr>
         <w:t xml:space="preserve">Furth-Matzkin, M. (2017). On the unexpected use of unenforceable contract terms: Evidence from the residential rental market. *Journal of Legal Analysis, 9*(1), 1-49. </w:t>
       </w:r>
-      <w:hyperlink r:id="rId25">
+      <w:hyperlink r:id="rId26">
         <w:r>
           <w:rPr>
             <w:rStyle w:val="Hyperlink"/>
@@ -14000,7 +14001,7 @@
         </w:rPr>
         <w:t xml:space="preserve">Furth-Matzkin, M. (2019). The harmful effects of unenforceable contract terms: Experimental evidence. *Alabama Law Review, 70*(4), 1031-1086. </w:t>
       </w:r>
-      <w:hyperlink r:id="rId26">
+      <w:hyperlink r:id="rId27">
         <w:r>
           <w:rPr>
             <w:rStyle w:val="Hyperlink"/>
@@ -14040,7 +14041,7 @@
         </w:rPr>
         <w:t xml:space="preserve">, M. J., &amp; Moskowitz, T. J. (2004). Confronting information asymmetries: Evidence from real estate markets. *The Review of Financial Studies, 17*(2), 405-437. </w:t>
       </w:r>
-      <w:hyperlink r:id="rId27">
+      <w:hyperlink r:id="rId28">
         <w:r>
           <w:rPr>
             <w:rStyle w:val="Hyperlink"/>
@@ -14107,7 +14108,7 @@
         </w:rPr>
         <w:t xml:space="preserve">, Article 1782405. </w:t>
       </w:r>
-      <w:hyperlink r:id="rId28">
+      <w:hyperlink r:id="rId29">
         <w:r>
           <w:rPr>
             <w:rStyle w:val="Hyperlink"/>
@@ -14141,7 +14142,7 @@
         </w:rPr>
         <w:t xml:space="preserve">Kessler, F. (1943). Contracts of adhesion, Some thoughts about freedom of contract. *Columbia Law Review, 43*(5), 629-642. </w:t>
       </w:r>
-      <w:hyperlink r:id="rId29">
+      <w:hyperlink r:id="rId30">
         <w:r>
           <w:rPr>
             <w:rStyle w:val="Hyperlink"/>
@@ -14183,7 +14184,7 @@
           <w:szCs w:val="22"/>
         </w:rPr>
       </w:pPr>
-      <w:hyperlink r:id="rId30">
+      <w:hyperlink r:id="rId31">
         <w:r>
           <w:rPr>
             <w:rStyle w:val="Hyperlink"/>
@@ -14223,7 +14224,7 @@
         </w:rPr>
         <w:t xml:space="preserve">. (2024). *AI-powered contract review platform for legal teams*. </w:t>
       </w:r>
-      <w:hyperlink r:id="rId31">
+      <w:hyperlink r:id="rId32">
         <w:r>
           <w:rPr>
             <w:rStyle w:val="Hyperlink"/>
@@ -14271,7 +14272,7 @@
         </w:rPr>
         <w:t xml:space="preserve"> Online, 12*, 203-212. [Hebrew]. </w:t>
       </w:r>
-      <w:hyperlink r:id="rId32">
+      <w:hyperlink r:id="rId33">
         <w:r>
           <w:rPr>
             <w:rStyle w:val="Hyperlink"/>
@@ -14356,7 +14357,7 @@
         </w:rPr>
         <w:t xml:space="preserve">), 33*, 9459-9474. </w:t>
       </w:r>
-      <w:hyperlink r:id="rId33">
+      <w:hyperlink r:id="rId34">
         <w:r>
           <w:rPr>
             <w:rStyle w:val="Hyperlink"/>
@@ -14386,7 +14387,7 @@
         </w:rPr>
         <w:t xml:space="preserve">Liu, N. F., Lin, K., Hewitt, J., Paranjape, A., Bevilacqua, M., Petroni, F., &amp; Liang, P. (2024). Lost in the middle: How language models use long contexts. *Transactions of the Association for Computational Linguistics, 12*, 157-173. </w:t>
       </w:r>
-      <w:hyperlink r:id="rId34">
+      <w:hyperlink r:id="rId35">
         <w:r>
           <w:rPr>
             <w:rStyle w:val="Hyperlink"/>
@@ -14434,7 +14435,7 @@
         </w:rPr>
         <w:t xml:space="preserve">, D. (2024). Conflicts within the neoliberal state? The limited representation of renters in Israeli housing policies and debates. *Housing Studies*, 1-20. </w:t>
       </w:r>
-      <w:hyperlink r:id="rId35">
+      <w:hyperlink r:id="rId36">
         <w:r>
           <w:rPr>
             <w:rStyle w:val="Hyperlink"/>
@@ -14464,7 +14465,7 @@
         </w:rPr>
         <w:t xml:space="preserve">Masson, M. E. J., &amp; Waldron, M. A. (1994). Comprehension of legal contracts by non-experts: Effectiveness of plain language redrafting. *Applied Cognitive Psychology, 8*(1), 67-85. </w:t>
       </w:r>
-      <w:hyperlink r:id="rId36">
+      <w:hyperlink r:id="rId37">
         <w:r>
           <w:rPr>
             <w:rStyle w:val="Hyperlink"/>
@@ -14504,7 +14505,7 @@
         </w:rPr>
         <w:t xml:space="preserve">, Y. (2026). *Beyond the shortage: A structural perspective on Israel’s housing market*. Shoresh Institution for Socioeconomic Research. </w:t>
       </w:r>
-      <w:hyperlink r:id="rId37">
+      <w:hyperlink r:id="rId38">
         <w:r>
           <w:rPr>
             <w:rStyle w:val="Hyperlink"/>
@@ -14552,7 +14553,7 @@
         </w:rPr>
         <w:t xml:space="preserve"> OECD Economics Department Working Papers No. 1170. Paris: OECD Publishing. </w:t>
       </w:r>
-      <w:hyperlink r:id="rId38">
+      <w:hyperlink r:id="rId39">
         <w:r>
           <w:rPr>
             <w:rStyle w:val="Hyperlink"/>
@@ -14600,7 +14601,7 @@
         </w:rPr>
         <w:t xml:space="preserve"> [Model documentation]. OpenAI. Retrieved June 30, 2026, from </w:t>
       </w:r>
-      <w:hyperlink r:id="rId39">
+      <w:hyperlink r:id="rId40">
         <w:r>
           <w:rPr>
             <w:rStyle w:val="Hyperlink"/>
@@ -14639,7 +14640,7 @@
         </w:rPr>
         <w:t xml:space="preserve">Rakoff, T. D. (1983). Contracts of adhesion: An essay in reconstruction. *Harvard Law Review, 96*(6), 1173-1284. </w:t>
       </w:r>
-      <w:hyperlink r:id="rId40">
+      <w:hyperlink r:id="rId41">
         <w:r>
           <w:rPr>
             <w:rStyle w:val="Hyperlink"/>
@@ -14669,7 +14670,7 @@
         </w:rPr>
         <w:t xml:space="preserve">Rhode, D. L. (2004). *Access to justice*. Oxford University Press. </w:t>
       </w:r>
-      <w:hyperlink r:id="rId41">
+      <w:hyperlink r:id="rId42">
         <w:r>
           <w:rPr>
             <w:rStyle w:val="Hyperlink"/>
@@ -14735,7 +14736,7 @@
         </w:rPr>
         <w:t xml:space="preserve"> document image analysis. *ICDAR 2021*. </w:t>
       </w:r>
-      <w:hyperlink r:id="rId42">
+      <w:hyperlink r:id="rId43">
         <w:r>
           <w:rPr>
             <w:rStyle w:val="Hyperlink"/>
@@ -14765,7 +14766,7 @@
         </w:rPr>
         <w:t xml:space="preserve">Spellbook. (2024). *AI contract drafting and review tool for lawyers*. </w:t>
       </w:r>
-      <w:hyperlink r:id="rId43">
+      <w:hyperlink r:id="rId44">
         <w:r>
           <w:rPr>
             <w:rStyle w:val="Hyperlink"/>
@@ -14805,7 +14806,7 @@
         </w:rPr>
         <w:t xml:space="preserve">, H. (2014). Machine learning and law. *Washington Law Review, 89*(1), 87-115. </w:t>
       </w:r>
-      <w:hyperlink r:id="rId44">
+      <w:hyperlink r:id="rId45">
         <w:r>
           <w:rPr>
             <w:rStyle w:val="Hyperlink"/>
@@ -14845,7 +14846,7 @@
         </w:rPr>
         <w:t xml:space="preserve">, P. M. (1999). *Legal language*. University of Chicago Press. </w:t>
       </w:r>
-      <w:hyperlink r:id="rId45">
+      <w:hyperlink r:id="rId46">
         <w:r>
           <w:rPr>
             <w:rStyle w:val="Hyperlink"/>
@@ -14921,7 +14922,7 @@
         </w:rPr>
         <w:t xml:space="preserve">, Y., Candito, M., … Tounsi, L. (2010). Statistical parsing of morphologically rich languages (SPMRL): What, how and whither. *Proceedings of the NAACL HLT Workshop on SPMRL*. </w:t>
       </w:r>
-      <w:hyperlink r:id="rId46">
+      <w:hyperlink r:id="rId47">
         <w:r>
           <w:rPr>
             <w:rStyle w:val="Hyperlink"/>
@@ -14962,7 +14963,7 @@
         </w:rPr>
         <w:t xml:space="preserve">. (2024). *Israeli rental background check and tenant verification platform*. </w:t>
       </w:r>
-      <w:hyperlink r:id="rId47">
+      <w:hyperlink r:id="rId48">
         <w:r>
           <w:rPr>
             <w:rStyle w:val="Hyperlink"/>
@@ -14975,10 +14976,10 @@
       </w:hyperlink>
     </w:p>
     <w:sectPr>
-      <w:headerReference w:type="default" r:id="rId48"/>
-      <w:footerReference w:type="default" r:id="rId49"/>
-      <w:headerReference w:type="first" r:id="rId50"/>
-      <w:footerReference w:type="first" r:id="rId51"/>
+      <w:headerReference w:type="default" r:id="rId49"/>
+      <w:footerReference w:type="default" r:id="rId50"/>
+      <w:headerReference w:type="first" r:id="rId51"/>
+      <w:footerReference w:type="first" r:id="rId52"/>
       <w:pgSz w:w="11906" w:h="16838"/>
       <w:pgMar w:top="1440" w:right="1440" w:bottom="1440" w:left="1440" w:header="708" w:footer="708" w:gutter="0"/>
       <w:cols w:space="720"/>

</xml_diff>